<commit_message>
update: index of ers
</commit_message>
<xml_diff>
--- a/TI.1.1. PAO202651_SOAP_JAVA_SINBDD_NRC36884_GR03/01. UML/01 ERS/ERS_SOAP_JAVA_SINBDD_GR69.docx
+++ b/TI.1.1. PAO202651_SOAP_JAVA_SINBDD_NRC36884_GR03/01. UML/01 ERS/ERS_SOAP_JAVA_SINBDD_GR69.docx
@@ -4363,7 +4363,7 @@
       <w:pPr>
         <w:pStyle w:val="Heading1"/>
       </w:pPr>
-      <w:bookmarkStart w:id="0" w:name="_Toc229513488"/>
+      <w:bookmarkStart w:id="0" w:name="_Toc242216705"/>
       <w:r>
         <w:lastRenderedPageBreak/>
         <w:t xml:space="preserve">ESPECIFICACIÓN DE </w:t>
@@ -4403,7 +4403,12 @@
             <w:rPr>
               <w:rFonts w:asciiTheme="minorHAnsi" w:eastAsiaTheme="minorEastAsia" w:hAnsiTheme="minorHAnsi" w:cstheme="minorBidi"/>
               <w:noProof/>
+              <w:color w:val="auto"/>
+              <w:kern w:val="2"/>
+              <w:sz w:val="24"/>
+              <w:szCs w:val="24"/>
               <w:lang w:val="es-EC" w:eastAsia="es-EC"/>
+              <w14:ligatures w14:val="standardContextual"/>
             </w:rPr>
           </w:pPr>
           <w:r>
@@ -4415,7 +4420,7 @@
           <w:r>
             <w:fldChar w:fldCharType="separate"/>
           </w:r>
-          <w:hyperlink w:anchor="_Toc229513488" w:history="1">
+          <w:hyperlink w:anchor="_Toc242216705" w:history="1">
             <w:r>
               <w:rPr>
                 <w:rStyle w:val="Hyperlink"/>
@@ -4442,7 +4447,7 @@
                 <w:noProof/>
                 <w:webHidden/>
               </w:rPr>
-              <w:instrText xml:space="preserve"> PAGEREF _Toc229513488 \h </w:instrText>
+              <w:instrText xml:space="preserve"> PAGEREF _Toc242216705 \h </w:instrText>
             </w:r>
             <w:r>
               <w:rPr>
@@ -4483,10 +4488,15 @@
             <w:rPr>
               <w:rFonts w:asciiTheme="minorHAnsi" w:eastAsiaTheme="minorEastAsia" w:hAnsiTheme="minorHAnsi" w:cstheme="minorBidi"/>
               <w:noProof/>
+              <w:color w:val="auto"/>
+              <w:kern w:val="2"/>
+              <w:sz w:val="24"/>
+              <w:szCs w:val="24"/>
               <w:lang w:val="es-EC" w:eastAsia="es-EC"/>
+              <w14:ligatures w14:val="standardContextual"/>
             </w:rPr>
           </w:pPr>
-          <w:hyperlink w:anchor="_Toc229513489" w:history="1">
+          <w:hyperlink w:anchor="_Toc242216706" w:history="1">
             <w:r>
               <w:rPr>
                 <w:rStyle w:val="Hyperlink"/>
@@ -4498,7 +4508,12 @@
               <w:rPr>
                 <w:rFonts w:asciiTheme="minorHAnsi" w:eastAsiaTheme="minorEastAsia" w:hAnsiTheme="minorHAnsi" w:cstheme="minorBidi"/>
                 <w:noProof/>
+                <w:color w:val="auto"/>
+                <w:kern w:val="2"/>
+                <w:sz w:val="24"/>
+                <w:szCs w:val="24"/>
                 <w:lang w:val="es-EC" w:eastAsia="es-EC"/>
+                <w14:ligatures w14:val="standardContextual"/>
               </w:rPr>
               <w:tab/>
             </w:r>
@@ -4528,7 +4543,7 @@
                 <w:noProof/>
                 <w:webHidden/>
               </w:rPr>
-              <w:instrText xml:space="preserve"> PAGEREF _Toc229513489 \h </w:instrText>
+              <w:instrText xml:space="preserve"> PAGEREF _Toc242216706 \h </w:instrText>
             </w:r>
             <w:r>
               <w:rPr>
@@ -4569,10 +4584,15 @@
             <w:rPr>
               <w:rFonts w:asciiTheme="minorHAnsi" w:eastAsiaTheme="minorEastAsia" w:hAnsiTheme="minorHAnsi" w:cstheme="minorBidi"/>
               <w:noProof/>
+              <w:color w:val="auto"/>
+              <w:kern w:val="2"/>
+              <w:sz w:val="24"/>
+              <w:szCs w:val="24"/>
               <w:lang w:val="es-EC" w:eastAsia="es-EC"/>
+              <w14:ligatures w14:val="standardContextual"/>
             </w:rPr>
           </w:pPr>
-          <w:hyperlink w:anchor="_Toc229513490" w:history="1">
+          <w:hyperlink w:anchor="_Toc242216707" w:history="1">
             <w:r>
               <w:rPr>
                 <w:rStyle w:val="Hyperlink"/>
@@ -4584,7 +4604,12 @@
               <w:rPr>
                 <w:rFonts w:asciiTheme="minorHAnsi" w:eastAsiaTheme="minorEastAsia" w:hAnsiTheme="minorHAnsi" w:cstheme="minorBidi"/>
                 <w:noProof/>
+                <w:color w:val="auto"/>
+                <w:kern w:val="2"/>
+                <w:sz w:val="24"/>
+                <w:szCs w:val="24"/>
                 <w:lang w:val="es-EC" w:eastAsia="es-EC"/>
+                <w14:ligatures w14:val="standardContextual"/>
               </w:rPr>
               <w:tab/>
             </w:r>
@@ -4614,7 +4639,7 @@
                 <w:noProof/>
                 <w:webHidden/>
               </w:rPr>
-              <w:instrText xml:space="preserve"> PAGEREF _Toc229513490 \h </w:instrText>
+              <w:instrText xml:space="preserve"> PAGEREF _Toc242216707 \h </w:instrText>
             </w:r>
             <w:r>
               <w:rPr>
@@ -4655,10 +4680,15 @@
             <w:rPr>
               <w:rFonts w:asciiTheme="minorHAnsi" w:eastAsiaTheme="minorEastAsia" w:hAnsiTheme="minorHAnsi" w:cstheme="minorBidi"/>
               <w:noProof/>
+              <w:color w:val="auto"/>
+              <w:kern w:val="2"/>
+              <w:sz w:val="24"/>
+              <w:szCs w:val="24"/>
               <w:lang w:val="es-EC" w:eastAsia="es-EC"/>
+              <w14:ligatures w14:val="standardContextual"/>
             </w:rPr>
           </w:pPr>
-          <w:hyperlink w:anchor="_Toc229513491" w:history="1">
+          <w:hyperlink w:anchor="_Toc242216708" w:history="1">
             <w:r>
               <w:rPr>
                 <w:rStyle w:val="Hyperlink"/>
@@ -4670,7 +4700,12 @@
               <w:rPr>
                 <w:rFonts w:asciiTheme="minorHAnsi" w:eastAsiaTheme="minorEastAsia" w:hAnsiTheme="minorHAnsi" w:cstheme="minorBidi"/>
                 <w:noProof/>
+                <w:color w:val="auto"/>
+                <w:kern w:val="2"/>
+                <w:sz w:val="24"/>
+                <w:szCs w:val="24"/>
                 <w:lang w:val="es-EC" w:eastAsia="es-EC"/>
+                <w14:ligatures w14:val="standardContextual"/>
               </w:rPr>
               <w:tab/>
             </w:r>
@@ -4700,7 +4735,7 @@
                 <w:noProof/>
                 <w:webHidden/>
               </w:rPr>
-              <w:instrText xml:space="preserve"> PAGEREF _Toc229513491 \h </w:instrText>
+              <w:instrText xml:space="preserve"> PAGEREF _Toc242216708 \h </w:instrText>
             </w:r>
             <w:r>
               <w:rPr>
@@ -4741,10 +4776,15 @@
             <w:rPr>
               <w:rFonts w:asciiTheme="minorHAnsi" w:eastAsiaTheme="minorEastAsia" w:hAnsiTheme="minorHAnsi" w:cstheme="minorBidi"/>
               <w:noProof/>
+              <w:color w:val="auto"/>
+              <w:kern w:val="2"/>
+              <w:sz w:val="24"/>
+              <w:szCs w:val="24"/>
               <w:lang w:val="es-EC" w:eastAsia="es-EC"/>
+              <w14:ligatures w14:val="standardContextual"/>
             </w:rPr>
           </w:pPr>
-          <w:hyperlink w:anchor="_Toc229513492" w:history="1">
+          <w:hyperlink w:anchor="_Toc242216709" w:history="1">
             <w:r>
               <w:rPr>
                 <w:rStyle w:val="Hyperlink"/>
@@ -4756,7 +4796,12 @@
               <w:rPr>
                 <w:rFonts w:asciiTheme="minorHAnsi" w:eastAsiaTheme="minorEastAsia" w:hAnsiTheme="minorHAnsi" w:cstheme="minorBidi"/>
                 <w:noProof/>
+                <w:color w:val="auto"/>
+                <w:kern w:val="2"/>
+                <w:sz w:val="24"/>
+                <w:szCs w:val="24"/>
                 <w:lang w:val="es-EC" w:eastAsia="es-EC"/>
+                <w14:ligatures w14:val="standardContextual"/>
               </w:rPr>
               <w:tab/>
             </w:r>
@@ -4786,7 +4831,7 @@
                 <w:noProof/>
                 <w:webHidden/>
               </w:rPr>
-              <w:instrText xml:space="preserve"> PAGEREF _Toc229513492 \h </w:instrText>
+              <w:instrText xml:space="preserve"> PAGEREF _Toc242216709 \h </w:instrText>
             </w:r>
             <w:r>
               <w:rPr>
@@ -4827,10 +4872,15 @@
             <w:rPr>
               <w:rFonts w:asciiTheme="minorHAnsi" w:eastAsiaTheme="minorEastAsia" w:hAnsiTheme="minorHAnsi" w:cstheme="minorBidi"/>
               <w:noProof/>
+              <w:color w:val="auto"/>
+              <w:kern w:val="2"/>
+              <w:sz w:val="24"/>
+              <w:szCs w:val="24"/>
               <w:lang w:val="es-EC" w:eastAsia="es-EC"/>
+              <w14:ligatures w14:val="standardContextual"/>
             </w:rPr>
           </w:pPr>
-          <w:hyperlink w:anchor="_Toc229513493" w:history="1">
+          <w:hyperlink w:anchor="_Toc242216710" w:history="1">
             <w:r>
               <w:rPr>
                 <w:rStyle w:val="Hyperlink"/>
@@ -4842,7 +4892,12 @@
               <w:rPr>
                 <w:rFonts w:asciiTheme="minorHAnsi" w:eastAsiaTheme="minorEastAsia" w:hAnsiTheme="minorHAnsi" w:cstheme="minorBidi"/>
                 <w:noProof/>
+                <w:color w:val="auto"/>
+                <w:kern w:val="2"/>
+                <w:sz w:val="24"/>
+                <w:szCs w:val="24"/>
                 <w:lang w:val="es-EC" w:eastAsia="es-EC"/>
+                <w14:ligatures w14:val="standardContextual"/>
               </w:rPr>
               <w:tab/>
             </w:r>
@@ -4872,7 +4927,7 @@
                 <w:noProof/>
                 <w:webHidden/>
               </w:rPr>
-              <w:instrText xml:space="preserve"> PAGEREF _Toc229513493 \h </w:instrText>
+              <w:instrText xml:space="preserve"> PAGEREF _Toc242216710 \h </w:instrText>
             </w:r>
             <w:r>
               <w:rPr>
@@ -4913,10 +4968,15 @@
             <w:rPr>
               <w:rFonts w:asciiTheme="minorHAnsi" w:eastAsiaTheme="minorEastAsia" w:hAnsiTheme="minorHAnsi" w:cstheme="minorBidi"/>
               <w:noProof/>
+              <w:color w:val="auto"/>
+              <w:kern w:val="2"/>
+              <w:sz w:val="24"/>
+              <w:szCs w:val="24"/>
               <w:lang w:val="es-EC" w:eastAsia="es-EC"/>
+              <w14:ligatures w14:val="standardContextual"/>
             </w:rPr>
           </w:pPr>
-          <w:hyperlink w:anchor="_Toc229513494" w:history="1">
+          <w:hyperlink w:anchor="_Toc242216711" w:history="1">
             <w:r>
               <w:rPr>
                 <w:rStyle w:val="Hyperlink"/>
@@ -4928,7 +4988,12 @@
               <w:rPr>
                 <w:rFonts w:asciiTheme="minorHAnsi" w:eastAsiaTheme="minorEastAsia" w:hAnsiTheme="minorHAnsi" w:cstheme="minorBidi"/>
                 <w:noProof/>
+                <w:color w:val="auto"/>
+                <w:kern w:val="2"/>
+                <w:sz w:val="24"/>
+                <w:szCs w:val="24"/>
                 <w:lang w:val="es-EC" w:eastAsia="es-EC"/>
+                <w14:ligatures w14:val="standardContextual"/>
               </w:rPr>
               <w:tab/>
             </w:r>
@@ -4958,7 +5023,7 @@
                 <w:noProof/>
                 <w:webHidden/>
               </w:rPr>
-              <w:instrText xml:space="preserve"> PAGEREF _Toc229513494 \h </w:instrText>
+              <w:instrText xml:space="preserve"> PAGEREF _Toc242216711 \h </w:instrText>
             </w:r>
             <w:r>
               <w:rPr>
@@ -4978,7 +5043,7 @@
                 <w:noProof/>
                 <w:webHidden/>
               </w:rPr>
-              <w:t>7</w:t>
+              <w:t>8</w:t>
             </w:r>
             <w:r>
               <w:rPr>
@@ -4999,10 +5064,15 @@
             <w:rPr>
               <w:rFonts w:asciiTheme="minorHAnsi" w:eastAsiaTheme="minorEastAsia" w:hAnsiTheme="minorHAnsi" w:cstheme="minorBidi"/>
               <w:noProof/>
+              <w:color w:val="auto"/>
+              <w:kern w:val="2"/>
+              <w:sz w:val="24"/>
+              <w:szCs w:val="24"/>
               <w:lang w:val="es-EC" w:eastAsia="es-EC"/>
+              <w14:ligatures w14:val="standardContextual"/>
             </w:rPr>
           </w:pPr>
-          <w:hyperlink w:anchor="_Toc229513495" w:history="1">
+          <w:hyperlink w:anchor="_Toc242216712" w:history="1">
             <w:r>
               <w:rPr>
                 <w:rStyle w:val="Hyperlink"/>
@@ -5014,7 +5084,12 @@
               <w:rPr>
                 <w:rFonts w:asciiTheme="minorHAnsi" w:eastAsiaTheme="minorEastAsia" w:hAnsiTheme="minorHAnsi" w:cstheme="minorBidi"/>
                 <w:noProof/>
+                <w:color w:val="auto"/>
+                <w:kern w:val="2"/>
+                <w:sz w:val="24"/>
+                <w:szCs w:val="24"/>
                 <w:lang w:val="es-EC" w:eastAsia="es-EC"/>
+                <w14:ligatures w14:val="standardContextual"/>
               </w:rPr>
               <w:tab/>
             </w:r>
@@ -5044,7 +5119,7 @@
                 <w:noProof/>
                 <w:webHidden/>
               </w:rPr>
-              <w:instrText xml:space="preserve"> PAGEREF _Toc229513495 \h </w:instrText>
+              <w:instrText xml:space="preserve"> PAGEREF _Toc242216712 \h </w:instrText>
             </w:r>
             <w:r>
               <w:rPr>
@@ -5085,10 +5160,15 @@
             <w:rPr>
               <w:rFonts w:asciiTheme="minorHAnsi" w:eastAsiaTheme="minorEastAsia" w:hAnsiTheme="minorHAnsi" w:cstheme="minorBidi"/>
               <w:noProof/>
+              <w:color w:val="auto"/>
+              <w:kern w:val="2"/>
+              <w:sz w:val="24"/>
+              <w:szCs w:val="24"/>
               <w:lang w:val="es-EC" w:eastAsia="es-EC"/>
+              <w14:ligatures w14:val="standardContextual"/>
             </w:rPr>
           </w:pPr>
-          <w:hyperlink w:anchor="_Toc229513496" w:history="1">
+          <w:hyperlink w:anchor="_Toc242216713" w:history="1">
             <w:r>
               <w:rPr>
                 <w:rStyle w:val="Hyperlink"/>
@@ -5100,7 +5180,12 @@
               <w:rPr>
                 <w:rFonts w:asciiTheme="minorHAnsi" w:eastAsiaTheme="minorEastAsia" w:hAnsiTheme="minorHAnsi" w:cstheme="minorBidi"/>
                 <w:noProof/>
+                <w:color w:val="auto"/>
+                <w:kern w:val="2"/>
+                <w:sz w:val="24"/>
+                <w:szCs w:val="24"/>
                 <w:lang w:val="es-EC" w:eastAsia="es-EC"/>
+                <w14:ligatures w14:val="standardContextual"/>
               </w:rPr>
               <w:tab/>
             </w:r>
@@ -5130,7 +5215,7 @@
                 <w:noProof/>
                 <w:webHidden/>
               </w:rPr>
-              <w:instrText xml:space="preserve"> PAGEREF _Toc229513496 \h </w:instrText>
+              <w:instrText xml:space="preserve"> PAGEREF _Toc242216713 \h </w:instrText>
             </w:r>
             <w:r>
               <w:rPr>
@@ -5171,10 +5256,15 @@
             <w:rPr>
               <w:rFonts w:asciiTheme="minorHAnsi" w:eastAsiaTheme="minorEastAsia" w:hAnsiTheme="minorHAnsi" w:cstheme="minorBidi"/>
               <w:noProof/>
+              <w:color w:val="auto"/>
+              <w:kern w:val="2"/>
+              <w:sz w:val="24"/>
+              <w:szCs w:val="24"/>
               <w:lang w:val="es-EC" w:eastAsia="es-EC"/>
+              <w14:ligatures w14:val="standardContextual"/>
             </w:rPr>
           </w:pPr>
-          <w:hyperlink w:anchor="_Toc229513497" w:history="1">
+          <w:hyperlink w:anchor="_Toc242216714" w:history="1">
             <w:r>
               <w:rPr>
                 <w:rStyle w:val="Hyperlink"/>
@@ -5186,7 +5276,12 @@
               <w:rPr>
                 <w:rFonts w:asciiTheme="minorHAnsi" w:eastAsiaTheme="minorEastAsia" w:hAnsiTheme="minorHAnsi" w:cstheme="minorBidi"/>
                 <w:noProof/>
+                <w:color w:val="auto"/>
+                <w:kern w:val="2"/>
+                <w:sz w:val="24"/>
+                <w:szCs w:val="24"/>
                 <w:lang w:val="es-EC" w:eastAsia="es-EC"/>
+                <w14:ligatures w14:val="standardContextual"/>
               </w:rPr>
               <w:tab/>
             </w:r>
@@ -5216,7 +5311,7 @@
                 <w:noProof/>
                 <w:webHidden/>
               </w:rPr>
-              <w:instrText xml:space="preserve"> PAGEREF _Toc229513497 \h </w:instrText>
+              <w:instrText xml:space="preserve"> PAGEREF _Toc242216714 \h </w:instrText>
             </w:r>
             <w:r>
               <w:rPr>
@@ -5236,7 +5331,7 @@
                 <w:noProof/>
                 <w:webHidden/>
               </w:rPr>
-              <w:t>8</w:t>
+              <w:t>9</w:t>
             </w:r>
             <w:r>
               <w:rPr>
@@ -5257,10 +5352,15 @@
             <w:rPr>
               <w:rFonts w:asciiTheme="minorHAnsi" w:eastAsiaTheme="minorEastAsia" w:hAnsiTheme="minorHAnsi" w:cstheme="minorBidi"/>
               <w:noProof/>
+              <w:color w:val="auto"/>
+              <w:kern w:val="2"/>
+              <w:sz w:val="24"/>
+              <w:szCs w:val="24"/>
               <w:lang w:val="es-EC" w:eastAsia="es-EC"/>
+              <w14:ligatures w14:val="standardContextual"/>
             </w:rPr>
           </w:pPr>
-          <w:hyperlink w:anchor="_Toc229513498" w:history="1">
+          <w:hyperlink w:anchor="_Toc242216715" w:history="1">
             <w:r>
               <w:rPr>
                 <w:rStyle w:val="Hyperlink"/>
@@ -5272,7 +5372,12 @@
               <w:rPr>
                 <w:rFonts w:asciiTheme="minorHAnsi" w:eastAsiaTheme="minorEastAsia" w:hAnsiTheme="minorHAnsi" w:cstheme="minorBidi"/>
                 <w:noProof/>
+                <w:color w:val="auto"/>
+                <w:kern w:val="2"/>
+                <w:sz w:val="24"/>
+                <w:szCs w:val="24"/>
                 <w:lang w:val="es-EC" w:eastAsia="es-EC"/>
+                <w14:ligatures w14:val="standardContextual"/>
               </w:rPr>
               <w:tab/>
             </w:r>
@@ -5302,7 +5407,7 @@
                 <w:noProof/>
                 <w:webHidden/>
               </w:rPr>
-              <w:instrText xml:space="preserve"> PAGEREF _Toc229513498 \h </w:instrText>
+              <w:instrText xml:space="preserve"> PAGEREF _Toc242216715 \h </w:instrText>
             </w:r>
             <w:r>
               <w:rPr>
@@ -5343,10 +5448,15 @@
             <w:rPr>
               <w:rFonts w:asciiTheme="minorHAnsi" w:eastAsiaTheme="minorEastAsia" w:hAnsiTheme="minorHAnsi" w:cstheme="minorBidi"/>
               <w:noProof/>
+              <w:color w:val="auto"/>
+              <w:kern w:val="2"/>
+              <w:sz w:val="24"/>
+              <w:szCs w:val="24"/>
               <w:lang w:val="es-EC" w:eastAsia="es-EC"/>
+              <w14:ligatures w14:val="standardContextual"/>
             </w:rPr>
           </w:pPr>
-          <w:hyperlink w:anchor="_Toc229513499" w:history="1">
+          <w:hyperlink w:anchor="_Toc242216716" w:history="1">
             <w:r>
               <w:rPr>
                 <w:rStyle w:val="Hyperlink"/>
@@ -5358,7 +5468,12 @@
               <w:rPr>
                 <w:rFonts w:asciiTheme="minorHAnsi" w:eastAsiaTheme="minorEastAsia" w:hAnsiTheme="minorHAnsi" w:cstheme="minorBidi"/>
                 <w:noProof/>
+                <w:color w:val="auto"/>
+                <w:kern w:val="2"/>
+                <w:sz w:val="24"/>
+                <w:szCs w:val="24"/>
                 <w:lang w:val="es-EC" w:eastAsia="es-EC"/>
+                <w14:ligatures w14:val="standardContextual"/>
               </w:rPr>
               <w:tab/>
             </w:r>
@@ -5388,7 +5503,7 @@
                 <w:noProof/>
                 <w:webHidden/>
               </w:rPr>
-              <w:instrText xml:space="preserve"> PAGEREF _Toc229513499 \h </w:instrText>
+              <w:instrText xml:space="preserve"> PAGEREF _Toc242216716 \h </w:instrText>
             </w:r>
             <w:r>
               <w:rPr>
@@ -5428,10 +5543,15 @@
             <w:rPr>
               <w:rFonts w:asciiTheme="minorHAnsi" w:eastAsiaTheme="minorEastAsia" w:hAnsiTheme="minorHAnsi" w:cstheme="minorBidi"/>
               <w:noProof/>
+              <w:color w:val="auto"/>
+              <w:kern w:val="2"/>
+              <w:sz w:val="24"/>
+              <w:szCs w:val="24"/>
               <w:lang w:val="es-EC" w:eastAsia="es-EC"/>
+              <w14:ligatures w14:val="standardContextual"/>
             </w:rPr>
           </w:pPr>
-          <w:hyperlink w:anchor="_Toc229513500" w:history="1">
+          <w:hyperlink w:anchor="_Toc242216717" w:history="1">
             <w:r>
               <w:rPr>
                 <w:rStyle w:val="Hyperlink"/>
@@ -5458,7 +5578,7 @@
                 <w:noProof/>
                 <w:webHidden/>
               </w:rPr>
-              <w:instrText xml:space="preserve"> PAGEREF _Toc229513500 \h </w:instrText>
+              <w:instrText xml:space="preserve"> PAGEREF _Toc242216717 \h </w:instrText>
             </w:r>
             <w:r>
               <w:rPr>
@@ -5478,7 +5598,7 @@
                 <w:noProof/>
                 <w:webHidden/>
               </w:rPr>
-              <w:t>9</w:t>
+              <w:t>11</w:t>
             </w:r>
             <w:r>
               <w:rPr>
@@ -5498,10 +5618,15 @@
             <w:rPr>
               <w:rFonts w:asciiTheme="minorHAnsi" w:eastAsiaTheme="minorEastAsia" w:hAnsiTheme="minorHAnsi" w:cstheme="minorBidi"/>
               <w:noProof/>
+              <w:color w:val="auto"/>
+              <w:kern w:val="2"/>
+              <w:sz w:val="24"/>
+              <w:szCs w:val="24"/>
               <w:lang w:val="es-EC" w:eastAsia="es-EC"/>
+              <w14:ligatures w14:val="standardContextual"/>
             </w:rPr>
           </w:pPr>
-          <w:hyperlink w:anchor="_Toc229513501" w:history="1">
+          <w:hyperlink w:anchor="_Toc242216718" w:history="1">
             <w:r>
               <w:rPr>
                 <w:rStyle w:val="Hyperlink"/>
@@ -5528,7 +5653,7 @@
                 <w:noProof/>
                 <w:webHidden/>
               </w:rPr>
-              <w:instrText xml:space="preserve"> PAGEREF _Toc229513501 \h </w:instrText>
+              <w:instrText xml:space="preserve"> PAGEREF _Toc242216718 \h </w:instrText>
             </w:r>
             <w:r>
               <w:rPr>
@@ -5548,7 +5673,7 @@
                 <w:noProof/>
                 <w:webHidden/>
               </w:rPr>
-              <w:t>9</w:t>
+              <w:t>11</w:t>
             </w:r>
             <w:r>
               <w:rPr>
@@ -5568,10 +5693,15 @@
             <w:rPr>
               <w:rFonts w:asciiTheme="minorHAnsi" w:eastAsiaTheme="minorEastAsia" w:hAnsiTheme="minorHAnsi" w:cstheme="minorBidi"/>
               <w:noProof/>
+              <w:color w:val="auto"/>
+              <w:kern w:val="2"/>
+              <w:sz w:val="24"/>
+              <w:szCs w:val="24"/>
               <w:lang w:val="es-EC" w:eastAsia="es-EC"/>
+              <w14:ligatures w14:val="standardContextual"/>
             </w:rPr>
           </w:pPr>
-          <w:hyperlink w:anchor="_Toc229513502" w:history="1">
+          <w:hyperlink w:anchor="_Toc242216719" w:history="1">
             <w:r>
               <w:rPr>
                 <w:rStyle w:val="Hyperlink"/>
@@ -5598,7 +5728,7 @@
                 <w:noProof/>
                 <w:webHidden/>
               </w:rPr>
-              <w:instrText xml:space="preserve"> PAGEREF _Toc229513502 \h </w:instrText>
+              <w:instrText xml:space="preserve"> PAGEREF _Toc242216719 \h </w:instrText>
             </w:r>
             <w:r>
               <w:rPr>
@@ -5618,7 +5748,7 @@
                 <w:noProof/>
                 <w:webHidden/>
               </w:rPr>
-              <w:t>10</w:t>
+              <w:t>11</w:t>
             </w:r>
             <w:r>
               <w:rPr>
@@ -5638,13 +5768,19 @@
             <w:rPr>
               <w:rFonts w:asciiTheme="minorHAnsi" w:eastAsiaTheme="minorEastAsia" w:hAnsiTheme="minorHAnsi" w:cstheme="minorBidi"/>
               <w:noProof/>
+              <w:color w:val="auto"/>
+              <w:kern w:val="2"/>
+              <w:sz w:val="24"/>
+              <w:szCs w:val="24"/>
               <w:lang w:val="es-EC" w:eastAsia="es-EC"/>
+              <w14:ligatures w14:val="standardContextual"/>
             </w:rPr>
           </w:pPr>
-          <w:hyperlink w:anchor="_Toc229513503" w:history="1">
+          <w:hyperlink w:anchor="_Toc242216720" w:history="1">
             <w:r>
               <w:rPr>
                 <w:rStyle w:val="Hyperlink"/>
+                <w:rFonts w:cs="Calibri"/>
                 <w:noProof/>
               </w:rPr>
               <w:t>7.6 Restricciones</w:t>
@@ -5668,7 +5804,7 @@
                 <w:noProof/>
                 <w:webHidden/>
               </w:rPr>
-              <w:instrText xml:space="preserve"> PAGEREF _Toc229513503 \h </w:instrText>
+              <w:instrText xml:space="preserve"> PAGEREF _Toc242216720 \h </w:instrText>
             </w:r>
             <w:r>
               <w:rPr>
@@ -5688,7 +5824,7 @@
                 <w:noProof/>
                 <w:webHidden/>
               </w:rPr>
-              <w:t>10</w:t>
+              <w:t>11</w:t>
             </w:r>
             <w:r>
               <w:rPr>
@@ -5708,10 +5844,15 @@
             <w:rPr>
               <w:rFonts w:asciiTheme="minorHAnsi" w:eastAsiaTheme="minorEastAsia" w:hAnsiTheme="minorHAnsi" w:cstheme="minorBidi"/>
               <w:noProof/>
+              <w:color w:val="auto"/>
+              <w:kern w:val="2"/>
+              <w:sz w:val="24"/>
+              <w:szCs w:val="24"/>
               <w:lang w:val="es-EC" w:eastAsia="es-EC"/>
+              <w14:ligatures w14:val="standardContextual"/>
             </w:rPr>
           </w:pPr>
-          <w:hyperlink w:anchor="_Toc229513504" w:history="1">
+          <w:hyperlink w:anchor="_Toc242216721" w:history="1">
             <w:r>
               <w:rPr>
                 <w:rStyle w:val="Hyperlink"/>
@@ -5738,7 +5879,7 @@
                 <w:noProof/>
                 <w:webHidden/>
               </w:rPr>
-              <w:instrText xml:space="preserve"> PAGEREF _Toc229513504 \h </w:instrText>
+              <w:instrText xml:space="preserve"> PAGEREF _Toc242216721 \h </w:instrText>
             </w:r>
             <w:r>
               <w:rPr>
@@ -5758,7 +5899,7 @@
                 <w:noProof/>
                 <w:webHidden/>
               </w:rPr>
-              <w:t>10</w:t>
+              <w:t>11</w:t>
             </w:r>
             <w:r>
               <w:rPr>
@@ -5779,10 +5920,15 @@
             <w:rPr>
               <w:rFonts w:asciiTheme="minorHAnsi" w:eastAsiaTheme="minorEastAsia" w:hAnsiTheme="minorHAnsi" w:cstheme="minorBidi"/>
               <w:noProof/>
+              <w:color w:val="auto"/>
+              <w:kern w:val="2"/>
+              <w:sz w:val="24"/>
+              <w:szCs w:val="24"/>
               <w:lang w:val="es-EC" w:eastAsia="es-EC"/>
+              <w14:ligatures w14:val="standardContextual"/>
             </w:rPr>
           </w:pPr>
-          <w:hyperlink w:anchor="_Toc229513505" w:history="1">
+          <w:hyperlink w:anchor="_Toc242216722" w:history="1">
             <w:r>
               <w:rPr>
                 <w:rStyle w:val="Hyperlink"/>
@@ -5794,7 +5940,12 @@
               <w:rPr>
                 <w:rFonts w:asciiTheme="minorHAnsi" w:eastAsiaTheme="minorEastAsia" w:hAnsiTheme="minorHAnsi" w:cstheme="minorBidi"/>
                 <w:noProof/>
+                <w:color w:val="auto"/>
+                <w:kern w:val="2"/>
+                <w:sz w:val="24"/>
+                <w:szCs w:val="24"/>
                 <w:lang w:val="es-EC" w:eastAsia="es-EC"/>
+                <w14:ligatures w14:val="standardContextual"/>
               </w:rPr>
               <w:tab/>
             </w:r>
@@ -5824,7 +5975,7 @@
                 <w:noProof/>
                 <w:webHidden/>
               </w:rPr>
-              <w:instrText xml:space="preserve"> PAGEREF _Toc229513505 \h </w:instrText>
+              <w:instrText xml:space="preserve"> PAGEREF _Toc242216722 \h </w:instrText>
             </w:r>
             <w:r>
               <w:rPr>
@@ -5844,7 +5995,7 @@
                 <w:noProof/>
                 <w:webHidden/>
               </w:rPr>
-              <w:t>11</w:t>
+              <w:t>12</w:t>
             </w:r>
             <w:r>
               <w:rPr>
@@ -5864,10 +6015,15 @@
             <w:rPr>
               <w:rFonts w:asciiTheme="minorHAnsi" w:eastAsiaTheme="minorEastAsia" w:hAnsiTheme="minorHAnsi" w:cstheme="minorBidi"/>
               <w:noProof/>
+              <w:color w:val="auto"/>
+              <w:kern w:val="2"/>
+              <w:sz w:val="24"/>
+              <w:szCs w:val="24"/>
               <w:lang w:val="es-EC" w:eastAsia="es-EC"/>
+              <w14:ligatures w14:val="standardContextual"/>
             </w:rPr>
           </w:pPr>
-          <w:hyperlink w:anchor="_Toc229513506" w:history="1">
+          <w:hyperlink w:anchor="_Toc242216723" w:history="1">
             <w:r>
               <w:rPr>
                 <w:rStyle w:val="Hyperlink"/>
@@ -5894,7 +6050,7 @@
                 <w:noProof/>
                 <w:webHidden/>
               </w:rPr>
-              <w:instrText xml:space="preserve"> PAGEREF _Toc229513506 \h </w:instrText>
+              <w:instrText xml:space="preserve"> PAGEREF _Toc242216723 \h </w:instrText>
             </w:r>
             <w:r>
               <w:rPr>
@@ -5914,7 +6070,7 @@
                 <w:noProof/>
                 <w:webHidden/>
               </w:rPr>
-              <w:t>11</w:t>
+              <w:t>12</w:t>
             </w:r>
             <w:r>
               <w:rPr>
@@ -5934,10 +6090,15 @@
             <w:rPr>
               <w:rFonts w:asciiTheme="minorHAnsi" w:eastAsiaTheme="minorEastAsia" w:hAnsiTheme="minorHAnsi" w:cstheme="minorBidi"/>
               <w:noProof/>
+              <w:color w:val="auto"/>
+              <w:kern w:val="2"/>
+              <w:sz w:val="24"/>
+              <w:szCs w:val="24"/>
               <w:lang w:val="es-EC" w:eastAsia="es-EC"/>
+              <w14:ligatures w14:val="standardContextual"/>
             </w:rPr>
           </w:pPr>
-          <w:hyperlink w:anchor="_Toc229513507" w:history="1">
+          <w:hyperlink w:anchor="_Toc242216724" w:history="1">
             <w:r>
               <w:rPr>
                 <w:rStyle w:val="Hyperlink"/>
@@ -5964,7 +6125,7 @@
                 <w:noProof/>
                 <w:webHidden/>
               </w:rPr>
-              <w:instrText xml:space="preserve"> PAGEREF _Toc229513507 \h </w:instrText>
+              <w:instrText xml:space="preserve"> PAGEREF _Toc242216724 \h </w:instrText>
             </w:r>
             <w:r>
               <w:rPr>
@@ -5984,7 +6145,7 @@
                 <w:noProof/>
                 <w:webHidden/>
               </w:rPr>
-              <w:t>11</w:t>
+              <w:t>12</w:t>
             </w:r>
             <w:r>
               <w:rPr>
@@ -6004,10 +6165,15 @@
             <w:rPr>
               <w:rFonts w:asciiTheme="minorHAnsi" w:eastAsiaTheme="minorEastAsia" w:hAnsiTheme="minorHAnsi" w:cstheme="minorBidi"/>
               <w:noProof/>
+              <w:color w:val="auto"/>
+              <w:kern w:val="2"/>
+              <w:sz w:val="24"/>
+              <w:szCs w:val="24"/>
               <w:lang w:val="es-EC" w:eastAsia="es-EC"/>
+              <w14:ligatures w14:val="standardContextual"/>
             </w:rPr>
           </w:pPr>
-          <w:hyperlink w:anchor="_Toc229513508" w:history="1">
+          <w:hyperlink w:anchor="_Toc242216725" w:history="1">
             <w:r>
               <w:rPr>
                 <w:rStyle w:val="Hyperlink"/>
@@ -6034,7 +6200,7 @@
                 <w:noProof/>
                 <w:webHidden/>
               </w:rPr>
-              <w:instrText xml:space="preserve"> PAGEREF _Toc229513508 \h </w:instrText>
+              <w:instrText xml:space="preserve"> PAGEREF _Toc242216725 \h </w:instrText>
             </w:r>
             <w:r>
               <w:rPr>
@@ -6054,7 +6220,7 @@
                 <w:noProof/>
                 <w:webHidden/>
               </w:rPr>
-              <w:t>11</w:t>
+              <w:t>12</w:t>
             </w:r>
             <w:r>
               <w:rPr>
@@ -6074,10 +6240,15 @@
             <w:rPr>
               <w:rFonts w:asciiTheme="minorHAnsi" w:eastAsiaTheme="minorEastAsia" w:hAnsiTheme="minorHAnsi" w:cstheme="minorBidi"/>
               <w:noProof/>
+              <w:color w:val="auto"/>
+              <w:kern w:val="2"/>
+              <w:sz w:val="24"/>
+              <w:szCs w:val="24"/>
               <w:lang w:val="es-EC" w:eastAsia="es-EC"/>
+              <w14:ligatures w14:val="standardContextual"/>
             </w:rPr>
           </w:pPr>
-          <w:hyperlink w:anchor="_Toc229513509" w:history="1">
+          <w:hyperlink w:anchor="_Toc242216726" w:history="1">
             <w:r>
               <w:rPr>
                 <w:rStyle w:val="Hyperlink"/>
@@ -6104,7 +6275,7 @@
                 <w:noProof/>
                 <w:webHidden/>
               </w:rPr>
-              <w:instrText xml:space="preserve"> PAGEREF _Toc229513509 \h </w:instrText>
+              <w:instrText xml:space="preserve"> PAGEREF _Toc242216726 \h </w:instrText>
             </w:r>
             <w:r>
               <w:rPr>
@@ -6124,7 +6295,7 @@
                 <w:noProof/>
                 <w:webHidden/>
               </w:rPr>
-              <w:t>12</w:t>
+              <w:t>13</w:t>
             </w:r>
             <w:r>
               <w:rPr>
@@ -6144,10 +6315,15 @@
             <w:rPr>
               <w:rFonts w:asciiTheme="minorHAnsi" w:eastAsiaTheme="minorEastAsia" w:hAnsiTheme="minorHAnsi" w:cstheme="minorBidi"/>
               <w:noProof/>
+              <w:color w:val="auto"/>
+              <w:kern w:val="2"/>
+              <w:sz w:val="24"/>
+              <w:szCs w:val="24"/>
               <w:lang w:val="es-EC" w:eastAsia="es-EC"/>
+              <w14:ligatures w14:val="standardContextual"/>
             </w:rPr>
           </w:pPr>
-          <w:hyperlink w:anchor="_Toc229513510" w:history="1">
+          <w:hyperlink w:anchor="_Toc242216727" w:history="1">
             <w:r>
               <w:rPr>
                 <w:rStyle w:val="Hyperlink"/>
@@ -6174,7 +6350,7 @@
                 <w:noProof/>
                 <w:webHidden/>
               </w:rPr>
-              <w:instrText xml:space="preserve"> PAGEREF _Toc229513510 \h </w:instrText>
+              <w:instrText xml:space="preserve"> PAGEREF _Toc242216727 \h </w:instrText>
             </w:r>
             <w:r>
               <w:rPr>
@@ -6194,7 +6370,7 @@
                 <w:noProof/>
                 <w:webHidden/>
               </w:rPr>
-              <w:t>13</w:t>
+              <w:t>14</w:t>
             </w:r>
             <w:r>
               <w:rPr>
@@ -6214,10 +6390,15 @@
             <w:rPr>
               <w:rFonts w:asciiTheme="minorHAnsi" w:eastAsiaTheme="minorEastAsia" w:hAnsiTheme="minorHAnsi" w:cstheme="minorBidi"/>
               <w:noProof/>
+              <w:color w:val="auto"/>
+              <w:kern w:val="2"/>
+              <w:sz w:val="24"/>
+              <w:szCs w:val="24"/>
               <w:lang w:val="es-EC" w:eastAsia="es-EC"/>
+              <w14:ligatures w14:val="standardContextual"/>
             </w:rPr>
           </w:pPr>
-          <w:hyperlink w:anchor="_Toc229513511" w:history="1">
+          <w:hyperlink w:anchor="_Toc242216728" w:history="1">
             <w:r>
               <w:rPr>
                 <w:rStyle w:val="Hyperlink"/>
@@ -6244,7 +6425,7 @@
                 <w:noProof/>
                 <w:webHidden/>
               </w:rPr>
-              <w:instrText xml:space="preserve"> PAGEREF _Toc229513511 \h </w:instrText>
+              <w:instrText xml:space="preserve"> PAGEREF _Toc242216728 \h </w:instrText>
             </w:r>
             <w:r>
               <w:rPr>
@@ -6264,7 +6445,7 @@
                 <w:noProof/>
                 <w:webHidden/>
               </w:rPr>
-              <w:t>13</w:t>
+              <w:t>14</w:t>
             </w:r>
             <w:r>
               <w:rPr>
@@ -6284,10 +6465,15 @@
             <w:rPr>
               <w:rFonts w:asciiTheme="minorHAnsi" w:eastAsiaTheme="minorEastAsia" w:hAnsiTheme="minorHAnsi" w:cstheme="minorBidi"/>
               <w:noProof/>
+              <w:color w:val="auto"/>
+              <w:kern w:val="2"/>
+              <w:sz w:val="24"/>
+              <w:szCs w:val="24"/>
               <w:lang w:val="es-EC" w:eastAsia="es-EC"/>
+              <w14:ligatures w14:val="standardContextual"/>
             </w:rPr>
           </w:pPr>
-          <w:hyperlink w:anchor="_Toc229513512" w:history="1">
+          <w:hyperlink w:anchor="_Toc242216729" w:history="1">
             <w:r>
               <w:rPr>
                 <w:rStyle w:val="Hyperlink"/>
@@ -6314,7 +6500,7 @@
                 <w:noProof/>
                 <w:webHidden/>
               </w:rPr>
-              <w:instrText xml:space="preserve"> PAGEREF _Toc229513512 \h </w:instrText>
+              <w:instrText xml:space="preserve"> PAGEREF _Toc242216729 \h </w:instrText>
             </w:r>
             <w:r>
               <w:rPr>
@@ -6334,7 +6520,7 @@
                 <w:noProof/>
                 <w:webHidden/>
               </w:rPr>
-              <w:t>13</w:t>
+              <w:t>14</w:t>
             </w:r>
             <w:r>
               <w:rPr>
@@ -6354,10 +6540,15 @@
             <w:rPr>
               <w:rFonts w:asciiTheme="minorHAnsi" w:eastAsiaTheme="minorEastAsia" w:hAnsiTheme="minorHAnsi" w:cstheme="minorBidi"/>
               <w:noProof/>
+              <w:color w:val="auto"/>
+              <w:kern w:val="2"/>
+              <w:sz w:val="24"/>
+              <w:szCs w:val="24"/>
               <w:lang w:val="es-EC" w:eastAsia="es-EC"/>
+              <w14:ligatures w14:val="standardContextual"/>
             </w:rPr>
           </w:pPr>
-          <w:hyperlink w:anchor="_Toc229513513" w:history="1">
+          <w:hyperlink w:anchor="_Toc242216730" w:history="1">
             <w:r>
               <w:rPr>
                 <w:rStyle w:val="Hyperlink"/>
@@ -6384,7 +6575,7 @@
                 <w:noProof/>
                 <w:webHidden/>
               </w:rPr>
-              <w:instrText xml:space="preserve"> PAGEREF _Toc229513513 \h </w:instrText>
+              <w:instrText xml:space="preserve"> PAGEREF _Toc242216730 \h </w:instrText>
             </w:r>
             <w:r>
               <w:rPr>
@@ -6404,7 +6595,7 @@
                 <w:noProof/>
                 <w:webHidden/>
               </w:rPr>
-              <w:t>13</w:t>
+              <w:t>15</w:t>
             </w:r>
             <w:r>
               <w:rPr>
@@ -6424,10 +6615,15 @@
             <w:rPr>
               <w:rFonts w:asciiTheme="minorHAnsi" w:eastAsiaTheme="minorEastAsia" w:hAnsiTheme="minorHAnsi" w:cstheme="minorBidi"/>
               <w:noProof/>
+              <w:color w:val="auto"/>
+              <w:kern w:val="2"/>
+              <w:sz w:val="24"/>
+              <w:szCs w:val="24"/>
               <w:lang w:val="es-EC" w:eastAsia="es-EC"/>
+              <w14:ligatures w14:val="standardContextual"/>
             </w:rPr>
           </w:pPr>
-          <w:hyperlink w:anchor="_Toc229513514" w:history="1">
+          <w:hyperlink w:anchor="_Toc242216731" w:history="1">
             <w:r>
               <w:rPr>
                 <w:rStyle w:val="Hyperlink"/>
@@ -6454,7 +6650,7 @@
                 <w:noProof/>
                 <w:webHidden/>
               </w:rPr>
-              <w:instrText xml:space="preserve"> PAGEREF _Toc229513514 \h </w:instrText>
+              <w:instrText xml:space="preserve"> PAGEREF _Toc242216731 \h </w:instrText>
             </w:r>
             <w:r>
               <w:rPr>
@@ -6474,7 +6670,7 @@
                 <w:noProof/>
                 <w:webHidden/>
               </w:rPr>
-              <w:t>14</w:t>
+              <w:t>15</w:t>
             </w:r>
             <w:r>
               <w:rPr>
@@ -6494,10 +6690,15 @@
             <w:rPr>
               <w:rFonts w:asciiTheme="minorHAnsi" w:eastAsiaTheme="minorEastAsia" w:hAnsiTheme="minorHAnsi" w:cstheme="minorBidi"/>
               <w:noProof/>
+              <w:color w:val="auto"/>
+              <w:kern w:val="2"/>
+              <w:sz w:val="24"/>
+              <w:szCs w:val="24"/>
               <w:lang w:val="es-EC" w:eastAsia="es-EC"/>
+              <w14:ligatures w14:val="standardContextual"/>
             </w:rPr>
           </w:pPr>
-          <w:hyperlink w:anchor="_Toc229513515" w:history="1">
+          <w:hyperlink w:anchor="_Toc242216732" w:history="1">
             <w:r>
               <w:rPr>
                 <w:rStyle w:val="Hyperlink"/>
@@ -6524,7 +6725,7 @@
                 <w:noProof/>
                 <w:webHidden/>
               </w:rPr>
-              <w:instrText xml:space="preserve"> PAGEREF _Toc229513515 \h </w:instrText>
+              <w:instrText xml:space="preserve"> PAGEREF _Toc242216732 \h </w:instrText>
             </w:r>
             <w:r>
               <w:rPr>
@@ -6544,7 +6745,7 @@
                 <w:noProof/>
                 <w:webHidden/>
               </w:rPr>
-              <w:t>14</w:t>
+              <w:t>17</w:t>
             </w:r>
             <w:r>
               <w:rPr>
@@ -6564,10 +6765,15 @@
             <w:rPr>
               <w:rFonts w:asciiTheme="minorHAnsi" w:eastAsiaTheme="minorEastAsia" w:hAnsiTheme="minorHAnsi" w:cstheme="minorBidi"/>
               <w:noProof/>
+              <w:color w:val="auto"/>
+              <w:kern w:val="2"/>
+              <w:sz w:val="24"/>
+              <w:szCs w:val="24"/>
               <w:lang w:val="es-EC" w:eastAsia="es-EC"/>
+              <w14:ligatures w14:val="standardContextual"/>
             </w:rPr>
           </w:pPr>
-          <w:hyperlink w:anchor="_Toc229513516" w:history="1">
+          <w:hyperlink w:anchor="_Toc242216733" w:history="1">
             <w:r>
               <w:rPr>
                 <w:rStyle w:val="Hyperlink"/>
@@ -6594,7 +6800,7 @@
                 <w:noProof/>
                 <w:webHidden/>
               </w:rPr>
-              <w:instrText xml:space="preserve"> PAGEREF _Toc229513516 \h </w:instrText>
+              <w:instrText xml:space="preserve"> PAGEREF _Toc242216733 \h </w:instrText>
             </w:r>
             <w:r>
               <w:rPr>
@@ -6614,7 +6820,7 @@
                 <w:noProof/>
                 <w:webHidden/>
               </w:rPr>
-              <w:t>16</w:t>
+              <w:t>19</w:t>
             </w:r>
             <w:r>
               <w:rPr>
@@ -6634,10 +6840,15 @@
             <w:rPr>
               <w:rFonts w:asciiTheme="minorHAnsi" w:eastAsiaTheme="minorEastAsia" w:hAnsiTheme="minorHAnsi" w:cstheme="minorBidi"/>
               <w:noProof/>
+              <w:color w:val="auto"/>
+              <w:kern w:val="2"/>
+              <w:sz w:val="24"/>
+              <w:szCs w:val="24"/>
               <w:lang w:val="es-EC" w:eastAsia="es-EC"/>
+              <w14:ligatures w14:val="standardContextual"/>
             </w:rPr>
           </w:pPr>
-          <w:hyperlink w:anchor="_Toc229513517" w:history="1">
+          <w:hyperlink w:anchor="_Toc242216734" w:history="1">
             <w:r>
               <w:rPr>
                 <w:rStyle w:val="Hyperlink"/>
@@ -6664,7 +6875,7 @@
                 <w:noProof/>
                 <w:webHidden/>
               </w:rPr>
-              <w:instrText xml:space="preserve"> PAGEREF _Toc229513517 \h </w:instrText>
+              <w:instrText xml:space="preserve"> PAGEREF _Toc242216734 \h </w:instrText>
             </w:r>
             <w:r>
               <w:rPr>
@@ -6684,7 +6895,7 @@
                 <w:noProof/>
                 <w:webHidden/>
               </w:rPr>
-              <w:t>16</w:t>
+              <w:t>19</w:t>
             </w:r>
             <w:r>
               <w:rPr>
@@ -6704,10 +6915,15 @@
             <w:rPr>
               <w:rFonts w:asciiTheme="minorHAnsi" w:eastAsiaTheme="minorEastAsia" w:hAnsiTheme="minorHAnsi" w:cstheme="minorBidi"/>
               <w:noProof/>
+              <w:color w:val="auto"/>
+              <w:kern w:val="2"/>
+              <w:sz w:val="24"/>
+              <w:szCs w:val="24"/>
               <w:lang w:val="es-EC" w:eastAsia="es-EC"/>
+              <w14:ligatures w14:val="standardContextual"/>
             </w:rPr>
           </w:pPr>
-          <w:hyperlink w:anchor="_Toc229513518" w:history="1">
+          <w:hyperlink w:anchor="_Toc242216735" w:history="1">
             <w:r>
               <w:rPr>
                 <w:rStyle w:val="Hyperlink"/>
@@ -6734,7 +6950,7 @@
                 <w:noProof/>
                 <w:webHidden/>
               </w:rPr>
-              <w:instrText xml:space="preserve"> PAGEREF _Toc229513518 \h </w:instrText>
+              <w:instrText xml:space="preserve"> PAGEREF _Toc242216735 \h </w:instrText>
             </w:r>
             <w:r>
               <w:rPr>
@@ -6754,7 +6970,7 @@
                 <w:noProof/>
                 <w:webHidden/>
               </w:rPr>
-              <w:t>17</w:t>
+              <w:t>20</w:t>
             </w:r>
             <w:r>
               <w:rPr>
@@ -6774,10 +6990,15 @@
             <w:rPr>
               <w:rFonts w:asciiTheme="minorHAnsi" w:eastAsiaTheme="minorEastAsia" w:hAnsiTheme="minorHAnsi" w:cstheme="minorBidi"/>
               <w:noProof/>
+              <w:color w:val="auto"/>
+              <w:kern w:val="2"/>
+              <w:sz w:val="24"/>
+              <w:szCs w:val="24"/>
               <w:lang w:val="es-EC" w:eastAsia="es-EC"/>
+              <w14:ligatures w14:val="standardContextual"/>
             </w:rPr>
           </w:pPr>
-          <w:hyperlink w:anchor="_Toc229513519" w:history="1">
+          <w:hyperlink w:anchor="_Toc242216736" w:history="1">
             <w:r>
               <w:rPr>
                 <w:rStyle w:val="Hyperlink"/>
@@ -6804,7 +7025,7 @@
                 <w:noProof/>
                 <w:webHidden/>
               </w:rPr>
-              <w:instrText xml:space="preserve"> PAGEREF _Toc229513519 \h </w:instrText>
+              <w:instrText xml:space="preserve"> PAGEREF _Toc242216736 \h </w:instrText>
             </w:r>
             <w:r>
               <w:rPr>
@@ -6824,7 +7045,7 @@
                 <w:noProof/>
                 <w:webHidden/>
               </w:rPr>
-              <w:t>17</w:t>
+              <w:t>20</w:t>
             </w:r>
             <w:r>
               <w:rPr>
@@ -6844,10 +7065,15 @@
             <w:rPr>
               <w:rFonts w:asciiTheme="minorHAnsi" w:eastAsiaTheme="minorEastAsia" w:hAnsiTheme="minorHAnsi" w:cstheme="minorBidi"/>
               <w:noProof/>
+              <w:color w:val="auto"/>
+              <w:kern w:val="2"/>
+              <w:sz w:val="24"/>
+              <w:szCs w:val="24"/>
               <w:lang w:val="es-EC" w:eastAsia="es-EC"/>
+              <w14:ligatures w14:val="standardContextual"/>
             </w:rPr>
           </w:pPr>
-          <w:hyperlink w:anchor="_Toc229513520" w:history="1">
+          <w:hyperlink w:anchor="_Toc242216737" w:history="1">
             <w:r>
               <w:rPr>
                 <w:rStyle w:val="Hyperlink"/>
@@ -6874,7 +7100,7 @@
                 <w:noProof/>
                 <w:webHidden/>
               </w:rPr>
-              <w:instrText xml:space="preserve"> PAGEREF _Toc229513520 \h </w:instrText>
+              <w:instrText xml:space="preserve"> PAGEREF _Toc242216737 \h </w:instrText>
             </w:r>
             <w:r>
               <w:rPr>
@@ -6894,7 +7120,7 @@
                 <w:noProof/>
                 <w:webHidden/>
               </w:rPr>
-              <w:t>18</w:t>
+              <w:t>20</w:t>
             </w:r>
             <w:r>
               <w:rPr>
@@ -6914,10 +7140,15 @@
             <w:rPr>
               <w:rFonts w:asciiTheme="minorHAnsi" w:eastAsiaTheme="minorEastAsia" w:hAnsiTheme="minorHAnsi" w:cstheme="minorBidi"/>
               <w:noProof/>
+              <w:color w:val="auto"/>
+              <w:kern w:val="2"/>
+              <w:sz w:val="24"/>
+              <w:szCs w:val="24"/>
               <w:lang w:val="es-EC" w:eastAsia="es-EC"/>
+              <w14:ligatures w14:val="standardContextual"/>
             </w:rPr>
           </w:pPr>
-          <w:hyperlink w:anchor="_Toc229513521" w:history="1">
+          <w:hyperlink w:anchor="_Toc242216738" w:history="1">
             <w:r>
               <w:rPr>
                 <w:rStyle w:val="Hyperlink"/>
@@ -6944,7 +7175,7 @@
                 <w:noProof/>
                 <w:webHidden/>
               </w:rPr>
-              <w:instrText xml:space="preserve"> PAGEREF _Toc229513521 \h </w:instrText>
+              <w:instrText xml:space="preserve"> PAGEREF _Toc242216738 \h </w:instrText>
             </w:r>
             <w:r>
               <w:rPr>
@@ -6964,7 +7195,7 @@
                 <w:noProof/>
                 <w:webHidden/>
               </w:rPr>
-              <w:t>18</w:t>
+              <w:t>21</w:t>
             </w:r>
             <w:r>
               <w:rPr>
@@ -6984,10 +7215,15 @@
             <w:rPr>
               <w:rFonts w:asciiTheme="minorHAnsi" w:eastAsiaTheme="minorEastAsia" w:hAnsiTheme="minorHAnsi" w:cstheme="minorBidi"/>
               <w:noProof/>
+              <w:color w:val="auto"/>
+              <w:kern w:val="2"/>
+              <w:sz w:val="24"/>
+              <w:szCs w:val="24"/>
               <w:lang w:val="es-EC" w:eastAsia="es-EC"/>
+              <w14:ligatures w14:val="standardContextual"/>
             </w:rPr>
           </w:pPr>
-          <w:hyperlink w:anchor="_Toc229513522" w:history="1">
+          <w:hyperlink w:anchor="_Toc242216739" w:history="1">
             <w:r>
               <w:rPr>
                 <w:rStyle w:val="Hyperlink"/>
@@ -7014,7 +7250,7 @@
                 <w:noProof/>
                 <w:webHidden/>
               </w:rPr>
-              <w:instrText xml:space="preserve"> PAGEREF _Toc229513522 \h </w:instrText>
+              <w:instrText xml:space="preserve"> PAGEREF _Toc242216739 \h </w:instrText>
             </w:r>
             <w:r>
               <w:rPr>
@@ -7034,7 +7270,7 @@
                 <w:noProof/>
                 <w:webHidden/>
               </w:rPr>
-              <w:t>18</w:t>
+              <w:t>21</w:t>
             </w:r>
             <w:r>
               <w:rPr>
@@ -7054,10 +7290,15 @@
             <w:rPr>
               <w:rFonts w:asciiTheme="minorHAnsi" w:eastAsiaTheme="minorEastAsia" w:hAnsiTheme="minorHAnsi" w:cstheme="minorBidi"/>
               <w:noProof/>
+              <w:color w:val="auto"/>
+              <w:kern w:val="2"/>
+              <w:sz w:val="24"/>
+              <w:szCs w:val="24"/>
               <w:lang w:val="es-EC" w:eastAsia="es-EC"/>
+              <w14:ligatures w14:val="standardContextual"/>
             </w:rPr>
           </w:pPr>
-          <w:hyperlink w:anchor="_Toc229513523" w:history="1">
+          <w:hyperlink w:anchor="_Toc242216740" w:history="1">
             <w:r>
               <w:rPr>
                 <w:rStyle w:val="Hyperlink"/>
@@ -7084,7 +7325,7 @@
                 <w:noProof/>
                 <w:webHidden/>
               </w:rPr>
-              <w:instrText xml:space="preserve"> PAGEREF _Toc229513523 \h </w:instrText>
+              <w:instrText xml:space="preserve"> PAGEREF _Toc242216740 \h </w:instrText>
             </w:r>
             <w:r>
               <w:rPr>
@@ -7104,7 +7345,7 @@
                 <w:noProof/>
                 <w:webHidden/>
               </w:rPr>
-              <w:t>18</w:t>
+              <w:t>21</w:t>
             </w:r>
             <w:r>
               <w:rPr>
@@ -7124,10 +7365,15 @@
             <w:rPr>
               <w:rFonts w:asciiTheme="minorHAnsi" w:eastAsiaTheme="minorEastAsia" w:hAnsiTheme="minorHAnsi" w:cstheme="minorBidi"/>
               <w:noProof/>
+              <w:color w:val="auto"/>
+              <w:kern w:val="2"/>
+              <w:sz w:val="24"/>
+              <w:szCs w:val="24"/>
               <w:lang w:val="es-EC" w:eastAsia="es-EC"/>
+              <w14:ligatures w14:val="standardContextual"/>
             </w:rPr>
           </w:pPr>
-          <w:hyperlink w:anchor="_Toc229513524" w:history="1">
+          <w:hyperlink w:anchor="_Toc242216741" w:history="1">
             <w:r>
               <w:rPr>
                 <w:rStyle w:val="Hyperlink"/>
@@ -7154,7 +7400,7 @@
                 <w:noProof/>
                 <w:webHidden/>
               </w:rPr>
-              <w:instrText xml:space="preserve"> PAGEREF _Toc229513524 \h </w:instrText>
+              <w:instrText xml:space="preserve"> PAGEREF _Toc242216741 \h </w:instrText>
             </w:r>
             <w:r>
               <w:rPr>
@@ -7174,7 +7420,7 @@
                 <w:noProof/>
                 <w:webHidden/>
               </w:rPr>
-              <w:t>18</w:t>
+              <w:t>21</w:t>
             </w:r>
             <w:r>
               <w:rPr>
@@ -7194,10 +7440,15 @@
             <w:rPr>
               <w:rFonts w:asciiTheme="minorHAnsi" w:eastAsiaTheme="minorEastAsia" w:hAnsiTheme="minorHAnsi" w:cstheme="minorBidi"/>
               <w:noProof/>
+              <w:color w:val="auto"/>
+              <w:kern w:val="2"/>
+              <w:sz w:val="24"/>
+              <w:szCs w:val="24"/>
               <w:lang w:val="es-EC" w:eastAsia="es-EC"/>
+              <w14:ligatures w14:val="standardContextual"/>
             </w:rPr>
           </w:pPr>
-          <w:hyperlink w:anchor="_Toc229513525" w:history="1">
+          <w:hyperlink w:anchor="_Toc242216742" w:history="1">
             <w:r>
               <w:rPr>
                 <w:rStyle w:val="Hyperlink"/>
@@ -7224,7 +7475,7 @@
                 <w:noProof/>
                 <w:webHidden/>
               </w:rPr>
-              <w:instrText xml:space="preserve"> PAGEREF _Toc229513525 \h </w:instrText>
+              <w:instrText xml:space="preserve"> PAGEREF _Toc242216742 \h </w:instrText>
             </w:r>
             <w:r>
               <w:rPr>
@@ -7244,7 +7495,7 @@
                 <w:noProof/>
                 <w:webHidden/>
               </w:rPr>
-              <w:t>18</w:t>
+              <w:t>21</w:t>
             </w:r>
             <w:r>
               <w:rPr>
@@ -7264,10 +7515,15 @@
             <w:rPr>
               <w:rFonts w:asciiTheme="minorHAnsi" w:eastAsiaTheme="minorEastAsia" w:hAnsiTheme="minorHAnsi" w:cstheme="minorBidi"/>
               <w:noProof/>
+              <w:color w:val="auto"/>
+              <w:kern w:val="2"/>
+              <w:sz w:val="24"/>
+              <w:szCs w:val="24"/>
               <w:lang w:val="es-EC" w:eastAsia="es-EC"/>
+              <w14:ligatures w14:val="standardContextual"/>
             </w:rPr>
           </w:pPr>
-          <w:hyperlink w:anchor="_Toc229513526" w:history="1">
+          <w:hyperlink w:anchor="_Toc242216743" w:history="1">
             <w:r>
               <w:rPr>
                 <w:rStyle w:val="Hyperlink"/>
@@ -7294,7 +7550,7 @@
                 <w:noProof/>
                 <w:webHidden/>
               </w:rPr>
-              <w:instrText xml:space="preserve"> PAGEREF _Toc229513526 \h </w:instrText>
+              <w:instrText xml:space="preserve"> PAGEREF _Toc242216743 \h </w:instrText>
             </w:r>
             <w:r>
               <w:rPr>
@@ -7314,7 +7570,7 @@
                 <w:noProof/>
                 <w:webHidden/>
               </w:rPr>
-              <w:t>19</w:t>
+              <w:t>21</w:t>
             </w:r>
             <w:r>
               <w:rPr>
@@ -7334,10 +7590,15 @@
             <w:rPr>
               <w:rFonts w:asciiTheme="minorHAnsi" w:eastAsiaTheme="minorEastAsia" w:hAnsiTheme="minorHAnsi" w:cstheme="minorBidi"/>
               <w:noProof/>
+              <w:color w:val="auto"/>
+              <w:kern w:val="2"/>
+              <w:sz w:val="24"/>
+              <w:szCs w:val="24"/>
               <w:lang w:val="es-EC" w:eastAsia="es-EC"/>
+              <w14:ligatures w14:val="standardContextual"/>
             </w:rPr>
           </w:pPr>
-          <w:hyperlink w:anchor="_Toc229513527" w:history="1">
+          <w:hyperlink w:anchor="_Toc242216744" w:history="1">
             <w:r>
               <w:rPr>
                 <w:rStyle w:val="Hyperlink"/>
@@ -7364,7 +7625,7 @@
                 <w:noProof/>
                 <w:webHidden/>
               </w:rPr>
-              <w:instrText xml:space="preserve"> PAGEREF _Toc229513527 \h </w:instrText>
+              <w:instrText xml:space="preserve"> PAGEREF _Toc242216744 \h </w:instrText>
             </w:r>
             <w:r>
               <w:rPr>
@@ -7384,7 +7645,7 @@
                 <w:noProof/>
                 <w:webHidden/>
               </w:rPr>
-              <w:t>19</w:t>
+              <w:t>21</w:t>
             </w:r>
             <w:r>
               <w:rPr>
@@ -10067,7 +10328,7 @@
         <w:spacing w:before="0" w:after="0" w:line="240" w:lineRule="auto"/>
       </w:pPr>
       <w:bookmarkStart w:id="3" w:name="_bookmark1"/>
-      <w:bookmarkStart w:id="4" w:name="_Toc229513489"/>
+      <w:bookmarkStart w:id="4" w:name="_Toc242216706"/>
       <w:bookmarkEnd w:id="3"/>
       <w:r>
         <w:lastRenderedPageBreak/>
@@ -10101,7 +10362,7 @@
         <w:spacing w:before="0" w:after="0" w:line="240" w:lineRule="auto"/>
       </w:pPr>
       <w:bookmarkStart w:id="5" w:name="_bookmark2"/>
-      <w:bookmarkStart w:id="6" w:name="_Toc229513490"/>
+      <w:bookmarkStart w:id="6" w:name="_Toc242216707"/>
       <w:bookmarkEnd w:id="5"/>
       <w:r>
         <w:t>Propósito</w:t>
@@ -10180,7 +10441,7 @@
         <w:spacing w:before="0" w:after="0" w:line="240" w:lineRule="auto"/>
       </w:pPr>
       <w:bookmarkStart w:id="8" w:name="_bookmark3"/>
-      <w:bookmarkStart w:id="9" w:name="_Toc229513491"/>
+      <w:bookmarkStart w:id="9" w:name="_Toc242216708"/>
       <w:bookmarkEnd w:id="8"/>
       <w:r>
         <w:t>Alcance</w:t>
@@ -10389,7 +10650,7 @@
         </w:numPr>
       </w:pPr>
       <w:bookmarkStart w:id="10" w:name="_bookmark4"/>
-      <w:bookmarkStart w:id="11" w:name="_Toc229513492"/>
+      <w:bookmarkStart w:id="11" w:name="_Toc242216709"/>
       <w:bookmarkEnd w:id="10"/>
       <w:r>
         <w:lastRenderedPageBreak/>
@@ -10405,7 +10666,7 @@
           <w:numId w:val="20"/>
         </w:numPr>
       </w:pPr>
-      <w:bookmarkStart w:id="12" w:name="_Toc229513493"/>
+      <w:bookmarkStart w:id="12" w:name="_Toc242216710"/>
       <w:r>
         <w:t>Definiciones</w:t>
       </w:r>
@@ -11221,7 +11482,6 @@
     </w:tbl>
     <w:p>
       <w:bookmarkStart w:id="22" w:name="_Toc61544630"/>
-      <w:bookmarkStart w:id="23" w:name="_Toc229513494"/>
     </w:p>
     <w:p>
       <w:pPr>
@@ -11231,6 +11491,7 @@
           <w:numId w:val="20"/>
         </w:numPr>
       </w:pPr>
+      <w:bookmarkStart w:id="23" w:name="_Toc242216711"/>
       <w:r>
         <w:t>Acrónimos y abreviaturas</w:t>
       </w:r>
@@ -11523,7 +11784,23 @@
                 <w:rFonts w:cs="Calibri"/>
                 <w:lang w:val="es-EC"/>
               </w:rPr>
-              <w:t xml:space="preserve">Lenguaje de Descripción de Servicios Web (Web Services </w:t>
+              <w:t xml:space="preserve">Lenguaje de Descripción de Servicios Web (Web </w:t>
+            </w:r>
+            <w:proofErr w:type="spellStart"/>
+            <w:r>
+              <w:rPr>
+                <w:rFonts w:cs="Calibri"/>
+                <w:lang w:val="es-EC"/>
+              </w:rPr>
+              <w:t>Services</w:t>
+            </w:r>
+            <w:proofErr w:type="spellEnd"/>
+            <w:r>
+              <w:rPr>
+                <w:rFonts w:cs="Calibri"/>
+                <w:lang w:val="es-EC"/>
+              </w:rPr>
+              <w:t xml:space="preserve"> </w:t>
             </w:r>
             <w:proofErr w:type="spellStart"/>
             <w:r>
@@ -12045,7 +12322,6 @@
         <w:pStyle w:val="Heading1"/>
         <w:ind w:left="360"/>
       </w:pPr>
-      <w:bookmarkStart w:id="27" w:name="_Toc229513495"/>
     </w:p>
     <w:p>
       <w:pPr>
@@ -12055,6 +12331,7 @@
           <w:numId w:val="20"/>
         </w:numPr>
       </w:pPr>
+      <w:bookmarkStart w:id="27" w:name="_Toc242216712"/>
       <w:r>
         <w:t>Referencias</w:t>
       </w:r>
@@ -12338,7 +12615,6 @@
         <w:ind w:left="360"/>
       </w:pPr>
       <w:bookmarkStart w:id="29" w:name="_bookmark6"/>
-      <w:bookmarkStart w:id="30" w:name="_Toc229513496"/>
       <w:bookmarkEnd w:id="29"/>
     </w:p>
     <w:p>
@@ -12349,6 +12625,7 @@
           <w:numId w:val="20"/>
         </w:numPr>
       </w:pPr>
+      <w:bookmarkStart w:id="30" w:name="_Toc242216713"/>
       <w:r>
         <w:t>Visión General del Documento</w:t>
       </w:r>
@@ -12407,7 +12684,7 @@
         <w:spacing w:before="0" w:after="0" w:line="240" w:lineRule="auto"/>
       </w:pPr>
       <w:bookmarkStart w:id="31" w:name="_bookmark7"/>
-      <w:bookmarkStart w:id="32" w:name="_Toc229513497"/>
+      <w:bookmarkStart w:id="32" w:name="_Toc242216714"/>
       <w:bookmarkEnd w:id="31"/>
       <w:r>
         <w:lastRenderedPageBreak/>
@@ -12444,7 +12721,7 @@
         </w:numPr>
         <w:spacing w:before="0" w:after="0"/>
       </w:pPr>
-      <w:bookmarkStart w:id="33" w:name="_Toc229513498"/>
+      <w:bookmarkStart w:id="33" w:name="_Toc242216715"/>
       <w:r>
         <w:t>Perspectiva del Producto</w:t>
       </w:r>
@@ -12474,7 +12751,7 @@
         <w:spacing w:before="0" w:after="0"/>
       </w:pPr>
       <w:bookmarkStart w:id="34" w:name="_bookmark9"/>
-      <w:bookmarkStart w:id="35" w:name="_Toc229513499"/>
+      <w:bookmarkStart w:id="35" w:name="_Toc242216716"/>
       <w:bookmarkEnd w:id="34"/>
       <w:r>
         <w:t>Funciones del Producto</w:t>
@@ -12783,11 +13060,11 @@
           <w:szCs w:val="24"/>
         </w:rPr>
       </w:pPr>
-      <w:bookmarkStart w:id="37" w:name="_Toc229513500"/>
       <w:r>
         <w:br w:type="page"/>
       </w:r>
     </w:p>
+    <w:bookmarkStart w:id="37" w:name="_Toc242216717"/>
     <w:p>
       <w:pPr>
         <w:pStyle w:val="Heading2"/>
@@ -12904,7 +13181,7 @@
         <w:spacing w:before="0" w:after="0"/>
       </w:pPr>
       <w:bookmarkStart w:id="39" w:name="_bookmark11"/>
-      <w:bookmarkStart w:id="40" w:name="_Toc229513501"/>
+      <w:bookmarkStart w:id="40" w:name="_Toc242216718"/>
       <w:bookmarkEnd w:id="39"/>
       <w:r>
         <w:t>7.</w:t>
@@ -13101,7 +13378,6 @@
         <w:pStyle w:val="Heading2"/>
       </w:pPr>
       <w:bookmarkStart w:id="42" w:name="_bookmark12"/>
-      <w:bookmarkStart w:id="43" w:name="_Toc229513502"/>
       <w:bookmarkEnd w:id="42"/>
     </w:p>
     <w:p>
@@ -13109,6 +13385,7 @@
         <w:pStyle w:val="Heading2"/>
         <w:spacing w:before="0" w:after="0"/>
       </w:pPr>
+      <w:bookmarkStart w:id="43" w:name="_Toc242216719"/>
       <w:r>
         <w:t xml:space="preserve">7.5 </w:t>
       </w:r>
@@ -13119,24 +13396,14 @@
     </w:p>
     <w:p>
       <w:pPr>
-        <w:pStyle w:val="Heading2"/>
         <w:rPr>
-          <w:rFonts w:eastAsia="Carlito" w:cs="Carlito"/>
-          <w:b w:val="0"/>
-          <w:bCs w:val="0"/>
-          <w:szCs w:val="22"/>
+          <w:b/>
+          <w:bCs/>
         </w:rPr>
       </w:pPr>
       <w:bookmarkStart w:id="44" w:name="_bookmark13"/>
-      <w:bookmarkStart w:id="45" w:name="_Toc229513503"/>
       <w:bookmarkEnd w:id="44"/>
       <w:r>
-        <w:rPr>
-          <w:rFonts w:eastAsia="Carlito" w:cs="Carlito"/>
-          <w:b w:val="0"/>
-          <w:bCs w:val="0"/>
-          <w:szCs w:val="22"/>
-        </w:rPr>
         <w:t>El sistema no requiere ni implementa conexión a ningún motor de base de datos. La interfaz externa principal es la capa de red que expone el servidor: a través de ella los cuatro clientes intercambian los mensajes SOAP de autenticación, consulta del catálogo y conversión.</w:t>
       </w:r>
     </w:p>
@@ -13149,6 +13416,7 @@
           <w:szCs w:val="22"/>
         </w:rPr>
       </w:pPr>
+      <w:bookmarkStart w:id="45" w:name="_Toc242216720"/>
       <w:r>
         <w:rPr>
           <w:rFonts w:cs="Calibri"/>
@@ -13287,10 +13555,7 @@
         <w:spacing w:before="0" w:after="0"/>
       </w:pPr>
       <w:r>
-        <w:t xml:space="preserve">Los cuatro clientes se desarrollan con las tecnologías indicadas en el enunciado: aplicación de consola en Java, cliente de escritorio en Java Swing, aplicación web (navegador) y aplicación móvil en </w:t>
-      </w:r>
-      <w:r>
-        <w:t>Android.</w:t>
+        <w:t>Los cuatro clientes se desarrollan con las tecnologías indicadas en el enunciado: aplicación de consola en Java, cliente de escritorio en Java Swing, aplicación web (navegador) y aplicación móvil en Android.</w:t>
       </w:r>
       <w:r>
         <w:t xml:space="preserve"> </w:t>
@@ -13312,7 +13577,7 @@
         <w:spacing w:before="0" w:after="0"/>
       </w:pPr>
       <w:bookmarkStart w:id="46" w:name="_bookmark14"/>
-      <w:bookmarkStart w:id="47" w:name="_Toc229513504"/>
+      <w:bookmarkStart w:id="47" w:name="_Toc242216721"/>
       <w:bookmarkEnd w:id="46"/>
       <w:r>
         <w:t xml:space="preserve">7.7 </w:t>
@@ -13393,7 +13658,7 @@
           <w:numId w:val="20"/>
         </w:numPr>
       </w:pPr>
-      <w:bookmarkStart w:id="48" w:name="_Toc229513505"/>
+      <w:bookmarkStart w:id="48" w:name="_Toc242216722"/>
       <w:r>
         <w:lastRenderedPageBreak/>
         <w:t>Especificación de Requerimientos</w:t>
@@ -13405,7 +13670,7 @@
         <w:pStyle w:val="Heading2"/>
       </w:pPr>
       <w:bookmarkStart w:id="49" w:name="_bookmark16"/>
-      <w:bookmarkStart w:id="50" w:name="_Toc229513506"/>
+      <w:bookmarkStart w:id="50" w:name="_Toc242216723"/>
       <w:bookmarkEnd w:id="49"/>
       <w:r>
         <w:t xml:space="preserve">8.1 </w:t>
@@ -13419,7 +13684,7 @@
       <w:pPr>
         <w:pStyle w:val="Heading3"/>
       </w:pPr>
-      <w:bookmarkStart w:id="51" w:name="_Toc229513507"/>
+      <w:bookmarkStart w:id="51" w:name="_Toc242216724"/>
       <w:r>
         <w:t xml:space="preserve">8.1.1 </w:t>
       </w:r>
@@ -13440,7 +13705,7 @@
       <w:pPr>
         <w:pStyle w:val="Heading3"/>
       </w:pPr>
-      <w:bookmarkStart w:id="52" w:name="_Toc229513508"/>
+      <w:bookmarkStart w:id="52" w:name="_Toc242216725"/>
       <w:r>
         <w:t xml:space="preserve">8.1.2 </w:t>
       </w:r>
@@ -14407,7 +14672,7 @@
       <w:pPr>
         <w:pStyle w:val="Heading3"/>
       </w:pPr>
-      <w:bookmarkStart w:id="54" w:name="_Toc229513509"/>
+      <w:bookmarkStart w:id="54" w:name="_Toc242216726"/>
       <w:r>
         <w:lastRenderedPageBreak/>
         <w:t xml:space="preserve">8.1.3 </w:t>
@@ -15077,7 +15342,7 @@
       <w:pPr>
         <w:pStyle w:val="Heading3"/>
       </w:pPr>
-      <w:bookmarkStart w:id="56" w:name="_Toc229513510"/>
+      <w:bookmarkStart w:id="56" w:name="_Toc242216727"/>
       <w:r>
         <w:lastRenderedPageBreak/>
         <w:t>8</w:t>
@@ -15207,7 +15472,7 @@
       <w:pPr>
         <w:pStyle w:val="Heading2"/>
       </w:pPr>
-      <w:bookmarkStart w:id="57" w:name="_Toc229513511"/>
+      <w:bookmarkStart w:id="57" w:name="_Toc242216728"/>
       <w:r>
         <w:t xml:space="preserve">8.2 </w:t>
       </w:r>
@@ -15220,7 +15485,7 @@
       <w:pPr>
         <w:pStyle w:val="Heading3"/>
       </w:pPr>
-      <w:bookmarkStart w:id="58" w:name="_Toc229513512"/>
+      <w:bookmarkStart w:id="58" w:name="_Toc242216729"/>
       <w:r>
         <w:t>8.2.1. Objetivo General</w:t>
       </w:r>
@@ -15592,7 +15857,6 @@
       <w:pPr>
         <w:pStyle w:val="Caption"/>
       </w:pPr>
-      <w:bookmarkStart w:id="61" w:name="_Toc229513513"/>
       <w:r>
         <w:t xml:space="preserve">Tabla </w:t>
       </w:r>
@@ -15615,10 +15879,7 @@
         <w:fldChar w:fldCharType="end"/>
       </w:r>
       <w:r>
-        <w:t>2</w:t>
-      </w:r>
-      <w:r>
-        <w:t xml:space="preserve">. </w:t>
+        <w:t xml:space="preserve">2. </w:t>
       </w:r>
       <w:r>
         <w:t>Consultar el catálogo de unidades</w:t>
@@ -15785,10 +16046,7 @@
         <w:fldChar w:fldCharType="end"/>
       </w:r>
       <w:r>
-        <w:t>3</w:t>
-      </w:r>
-      <w:r>
-        <w:t>. Re</w:t>
+        <w:t>3. Re</w:t>
       </w:r>
       <w:r>
         <w:t>spuestas Estructuradas</w:t>
@@ -15940,6 +16198,7 @@
       <w:pPr>
         <w:pStyle w:val="Heading3"/>
       </w:pPr>
+      <w:bookmarkStart w:id="61" w:name="_Toc242216730"/>
       <w:r>
         <w:t>8.2.3. Actores</w:t>
       </w:r>
@@ -16161,7 +16420,6 @@
       <w:pPr>
         <w:pStyle w:val="Caption"/>
       </w:pPr>
-      <w:bookmarkStart w:id="63" w:name="_Toc229513514"/>
       <w:r>
         <w:t xml:space="preserve">Tabla </w:t>
       </w:r>
@@ -17073,6 +17331,7 @@
       <w:pPr>
         <w:pStyle w:val="Heading3"/>
       </w:pPr>
+      <w:bookmarkStart w:id="63" w:name="_Toc242216731"/>
       <w:r>
         <w:t>8.2.4. Lista de requisitos funcionales</w:t>
       </w:r>
@@ -17785,12 +18044,12 @@
       <w:pPr>
         <w:pStyle w:val="Heading3"/>
       </w:pPr>
-      <w:bookmarkStart w:id="65" w:name="_Toc229513515"/>
     </w:p>
     <w:p>
       <w:pPr>
         <w:pStyle w:val="Heading3"/>
       </w:pPr>
+      <w:bookmarkStart w:id="65" w:name="_Toc242216732"/>
       <w:r>
         <w:lastRenderedPageBreak/>
         <w:t>8.2.5 Requisitos Funcionales</w:t>
@@ -18244,7 +18503,6 @@
       <w:pPr>
         <w:pStyle w:val="Caption"/>
       </w:pPr>
-      <w:bookmarkStart w:id="67" w:name="_Toc229513516"/>
       <w:r>
         <w:t xml:space="preserve">Tabla </w:t>
       </w:r>
@@ -21854,13 +22112,7 @@
         <w:rPr>
           <w:noProof/>
         </w:rPr>
-        <w:t>2</w:t>
-      </w:r>
-      <w:r>
-        <w:rPr>
-          <w:noProof/>
-        </w:rPr>
-        <w:t>9</w:t>
+        <w:t>29</w:t>
       </w:r>
       <w:r>
         <w:fldChar w:fldCharType="end"/>
@@ -22301,6 +22553,7 @@
       <w:pPr>
         <w:pStyle w:val="Heading2"/>
       </w:pPr>
+      <w:bookmarkStart w:id="67" w:name="_Toc242216733"/>
       <w:r>
         <w:t xml:space="preserve">8.3 </w:t>
       </w:r>
@@ -22320,7 +22573,7 @@
         <w:pStyle w:val="Heading3"/>
       </w:pPr>
       <w:bookmarkStart w:id="68" w:name="_Toc58077507"/>
-      <w:bookmarkStart w:id="69" w:name="_Toc229513517"/>
+      <w:bookmarkStart w:id="69" w:name="_Toc242216734"/>
       <w:r>
         <w:t xml:space="preserve">8.3.1 </w:t>
       </w:r>
@@ -22646,13 +22899,7 @@
         <w:rPr>
           <w:noProof/>
         </w:rPr>
-        <w:t>3</w:t>
-      </w:r>
-      <w:r>
-        <w:rPr>
-          <w:noProof/>
-        </w:rPr>
-        <w:t>1</w:t>
+        <w:t>31</w:t>
       </w:r>
       <w:r>
         <w:fldChar w:fldCharType="end"/>
@@ -22947,13 +23194,7 @@
         <w:rPr>
           <w:noProof/>
         </w:rPr>
-        <w:t>3</w:t>
-      </w:r>
-      <w:r>
-        <w:rPr>
-          <w:noProof/>
-        </w:rPr>
-        <w:t>2</w:t>
+        <w:t>32</w:t>
       </w:r>
       <w:r>
         <w:fldChar w:fldCharType="end"/>
@@ -23251,13 +23492,7 @@
         <w:rPr>
           <w:noProof/>
         </w:rPr>
-        <w:t>3</w:t>
-      </w:r>
-      <w:r>
-        <w:rPr>
-          <w:noProof/>
-        </w:rPr>
-        <w:t>3</w:t>
+        <w:t>33</w:t>
       </w:r>
       <w:r>
         <w:fldChar w:fldCharType="end"/>
@@ -23548,13 +23783,7 @@
         <w:rPr>
           <w:noProof/>
         </w:rPr>
-        <w:t>3</w:t>
-      </w:r>
-      <w:r>
-        <w:rPr>
-          <w:noProof/>
-        </w:rPr>
-        <w:t>4</w:t>
+        <w:t>34</w:t>
       </w:r>
       <w:r>
         <w:fldChar w:fldCharType="end"/>
@@ -23843,13 +24072,7 @@
         <w:rPr>
           <w:noProof/>
         </w:rPr>
-        <w:t>3</w:t>
-      </w:r>
-      <w:r>
-        <w:rPr>
-          <w:noProof/>
-        </w:rPr>
-        <w:t>5</w:t>
+        <w:t>35</w:t>
       </w:r>
       <w:r>
         <w:fldChar w:fldCharType="end"/>
@@ -24129,13 +24352,7 @@
         <w:rPr>
           <w:noProof/>
         </w:rPr>
-        <w:t>3</w:t>
-      </w:r>
-      <w:r>
-        <w:rPr>
-          <w:noProof/>
-        </w:rPr>
-        <w:t>6</w:t>
+        <w:t>36</w:t>
       </w:r>
       <w:r>
         <w:fldChar w:fldCharType="end"/>
@@ -24415,149 +24632,85 @@
     </w:p>
     <w:p>
       <w:pPr>
-        <w:pStyle w:val="Heading2"/>
-        <w:ind w:left="359"/>
+        <w:ind w:left="720"/>
         <w:rPr>
-          <w:rFonts w:eastAsia="Carlito" w:cs="Carlito"/>
-          <w:b w:val="0"/>
-          <w:bCs w:val="0"/>
-          <w:szCs w:val="22"/>
+          <w:b/>
+          <w:bCs/>
         </w:rPr>
       </w:pPr>
-      <w:bookmarkStart w:id="73" w:name="_Toc229513518"/>
-      <w:r>
-        <w:rPr>
-          <w:rFonts w:eastAsia="Carlito" w:cs="Carlito"/>
-          <w:b w:val="0"/>
-          <w:bCs w:val="0"/>
-          <w:szCs w:val="22"/>
-        </w:rPr>
+      <w:r>
         <w:t>• El sistema contará con control de acceso mediante tokens, con nombre de usuario y contraseña personales.</w:t>
       </w:r>
     </w:p>
     <w:p>
       <w:pPr>
-        <w:pStyle w:val="Heading2"/>
-        <w:ind w:left="359"/>
+        <w:ind w:left="720"/>
         <w:rPr>
-          <w:rFonts w:eastAsia="Carlito" w:cs="Carlito"/>
-          <w:b w:val="0"/>
-          <w:bCs w:val="0"/>
-          <w:szCs w:val="22"/>
+          <w:b/>
+          <w:bCs/>
         </w:rPr>
       </w:pPr>
       <w:r>
-        <w:rPr>
-          <w:rFonts w:eastAsia="Carlito" w:cs="Carlito"/>
-          <w:b w:val="0"/>
-          <w:bCs w:val="0"/>
-          <w:szCs w:val="22"/>
-        </w:rPr>
         <w:t>• El sistema opera sin base de datos; las validaciones se realizan en memoria.</w:t>
       </w:r>
     </w:p>
     <w:p>
       <w:pPr>
-        <w:pStyle w:val="Heading2"/>
-        <w:ind w:left="359"/>
+        <w:ind w:left="720"/>
         <w:rPr>
-          <w:rFonts w:eastAsia="Carlito" w:cs="Carlito"/>
-          <w:b w:val="0"/>
-          <w:bCs w:val="0"/>
-          <w:szCs w:val="22"/>
+          <w:b/>
+          <w:bCs/>
         </w:rPr>
       </w:pPr>
       <w:r>
-        <w:rPr>
-          <w:rFonts w:eastAsia="Carlito" w:cs="Carlito"/>
-          <w:b w:val="0"/>
-          <w:bCs w:val="0"/>
-          <w:szCs w:val="22"/>
-        </w:rPr>
         <w:t>• Emitirá mensajes de alerta cuando el usuario envíe parámetros erróneos.</w:t>
       </w:r>
     </w:p>
     <w:p>
       <w:pPr>
-        <w:pStyle w:val="Heading2"/>
-        <w:ind w:left="359"/>
+        <w:ind w:left="720"/>
         <w:rPr>
-          <w:rFonts w:eastAsia="Carlito" w:cs="Carlito"/>
-          <w:b w:val="0"/>
-          <w:bCs w:val="0"/>
-          <w:szCs w:val="22"/>
+          <w:b/>
+          <w:bCs/>
         </w:rPr>
       </w:pPr>
       <w:r>
-        <w:rPr>
-          <w:rFonts w:eastAsia="Carlito" w:cs="Carlito"/>
-          <w:b w:val="0"/>
-          <w:bCs w:val="0"/>
-          <w:szCs w:val="22"/>
-        </w:rPr>
         <w:t>• Emitirá mensajes de confirmación y el valor resultante al procesar las conversiones.</w:t>
       </w:r>
     </w:p>
     <w:p>
       <w:pPr>
-        <w:pStyle w:val="Heading2"/>
-        <w:ind w:left="359"/>
+        <w:ind w:left="720"/>
         <w:rPr>
-          <w:rFonts w:eastAsia="Carlito" w:cs="Carlito"/>
-          <w:b w:val="0"/>
-          <w:bCs w:val="0"/>
-          <w:szCs w:val="22"/>
+          <w:b/>
+          <w:bCs/>
         </w:rPr>
       </w:pPr>
       <w:r>
-        <w:rPr>
-          <w:rFonts w:eastAsia="Carlito" w:cs="Carlito"/>
-          <w:b w:val="0"/>
-          <w:bCs w:val="0"/>
-          <w:szCs w:val="22"/>
-        </w:rPr>
         <w:t>• Las operaciones se clasifican en Longitud, Masa o Temperatura.</w:t>
       </w:r>
     </w:p>
     <w:p>
       <w:pPr>
-        <w:pStyle w:val="Heading2"/>
-        <w:ind w:left="359"/>
+        <w:ind w:left="720"/>
         <w:rPr>
-          <w:rFonts w:eastAsia="Carlito" w:cs="Carlito"/>
-          <w:b w:val="0"/>
-          <w:bCs w:val="0"/>
-          <w:szCs w:val="22"/>
+          <w:b/>
+          <w:bCs/>
         </w:rPr>
       </w:pPr>
       <w:r>
-        <w:rPr>
-          <w:rFonts w:eastAsia="Carlito" w:cs="Carlito"/>
-          <w:b w:val="0"/>
-          <w:bCs w:val="0"/>
-          <w:szCs w:val="22"/>
-        </w:rPr>
         <w:t>• Los clientes habilitan las opciones de catálogo y conversión solo si poseen un token de sesión válido.</w:t>
       </w:r>
     </w:p>
     <w:p>
       <w:pPr>
-        <w:pStyle w:val="Heading2"/>
-        <w:ind w:left="359"/>
+        <w:ind w:left="720"/>
         <w:rPr>
-          <w:rFonts w:eastAsia="Carlito" w:cs="Carlito"/>
-          <w:b w:val="0"/>
-          <w:bCs w:val="0"/>
-          <w:szCs w:val="22"/>
+          <w:b/>
+          <w:bCs/>
         </w:rPr>
       </w:pPr>
       <w:r>
-        <w:rPr>
-          <w:rFonts w:eastAsia="Carlito" w:cs="Carlito"/>
-          <w:b w:val="0"/>
-          <w:bCs w:val="0"/>
-          <w:szCs w:val="22"/>
-        </w:rPr>
         <w:t>• El servidor central recibirá y procesará de forma simultánea las peticiones de todos los clientes conectados.</w:t>
       </w:r>
     </w:p>
@@ -24565,6 +24718,7 @@
       <w:pPr>
         <w:pStyle w:val="Heading2"/>
       </w:pPr>
+      <w:bookmarkStart w:id="73" w:name="_Toc242216735"/>
       <w:r>
         <w:t xml:space="preserve">8.4 </w:t>
       </w:r>
@@ -24577,7 +24731,7 @@
       <w:pPr>
         <w:pStyle w:val="Heading3"/>
       </w:pPr>
-      <w:bookmarkStart w:id="74" w:name="_Toc229513519"/>
+      <w:bookmarkStart w:id="74" w:name="_Toc242216736"/>
       <w:r>
         <w:t xml:space="preserve">8.4.1 </w:t>
       </w:r>
@@ -24623,7 +24777,7 @@
       </w:pPr>
       <w:bookmarkStart w:id="76" w:name="_2xcytpi" w:colFirst="0" w:colLast="0"/>
       <w:bookmarkStart w:id="77" w:name="_Toc58077511"/>
-      <w:bookmarkStart w:id="78" w:name="_Toc229513520"/>
+      <w:bookmarkStart w:id="78" w:name="_Toc242216737"/>
       <w:bookmarkEnd w:id="76"/>
       <w:r>
         <w:t xml:space="preserve">8.4.2 Restricciones de </w:t>
@@ -24670,10 +24824,11 @@
       <w:pPr>
         <w:ind w:left="720"/>
         <w:rPr>
-          <w:lang w:val="en-US"/>
+          <w:lang w:val="es-EC"/>
         </w:rPr>
       </w:pPr>
       <w:r>
+        <w:lastRenderedPageBreak/>
         <w:t>• Sistema operativo Windows 11, Linux o Android.</w:t>
       </w:r>
     </w:p>
@@ -24682,9 +24837,8 @@
         <w:pStyle w:val="Heading3"/>
       </w:pPr>
       <w:bookmarkStart w:id="79" w:name="_Toc58077512"/>
-      <w:bookmarkStart w:id="80" w:name="_Toc229513521"/>
-      <w:r>
-        <w:lastRenderedPageBreak/>
+      <w:bookmarkStart w:id="80" w:name="_Toc242216738"/>
+      <w:r>
         <w:t xml:space="preserve">8.4.3 </w:t>
       </w:r>
       <w:r>
@@ -24749,19 +24903,7 @@
         <w:rPr>
           <w:lang w:val="es-EC"/>
         </w:rPr>
-        <w:t>l usar SOAP, cualquier cliente puede consumir los servicios mediante mensajes XML, sin importar el lenguaje</w:t>
-      </w:r>
-      <w:r>
-        <w:rPr>
-          <w:lang w:val="es-EC"/>
-        </w:rPr>
-        <w:t xml:space="preserve"> </w:t>
-      </w:r>
-      <w:r>
-        <w:rPr>
-          <w:lang w:val="es-EC"/>
-        </w:rPr>
-        <w:t>de programación del cliente.</w:t>
+        <w:t>l usar SOAP, cualquier cliente puede consumir los servicios mediante mensajes XML, sin importar el lenguaje de programación del cliente.</w:t>
       </w:r>
     </w:p>
     <w:p>
@@ -24824,7 +24966,7 @@
       </w:pPr>
       <w:bookmarkStart w:id="81" w:name="_Toc23846806"/>
       <w:bookmarkStart w:id="82" w:name="_Toc58077513"/>
-      <w:bookmarkStart w:id="83" w:name="_Toc229513522"/>
+      <w:bookmarkStart w:id="83" w:name="_Toc242216739"/>
       <w:r>
         <w:t xml:space="preserve">9. </w:t>
       </w:r>
@@ -24841,7 +24983,7 @@
       </w:pPr>
       <w:bookmarkStart w:id="84" w:name="_Toc23846807"/>
       <w:bookmarkStart w:id="85" w:name="_Toc58077514"/>
-      <w:bookmarkStart w:id="86" w:name="_Toc229513523"/>
+      <w:bookmarkStart w:id="86" w:name="_Toc242216740"/>
       <w:r>
         <w:t>9.1. Requisitos de Interfaces Externas</w:t>
       </w:r>
@@ -24854,7 +24996,7 @@
         <w:pStyle w:val="Heading3"/>
       </w:pPr>
       <w:bookmarkStart w:id="87" w:name="_Toc58077515"/>
-      <w:bookmarkStart w:id="88" w:name="_Toc229513524"/>
+      <w:bookmarkStart w:id="88" w:name="_Toc242216741"/>
       <w:r>
         <w:t>9.1.1. Interfaces de Usuario</w:t>
       </w:r>
@@ -25035,7 +25177,7 @@
       <w:pPr>
         <w:pStyle w:val="Heading3"/>
       </w:pPr>
-      <w:bookmarkStart w:id="90" w:name="_Toc229513525"/>
+      <w:bookmarkStart w:id="90" w:name="_Toc242216742"/>
       <w:r>
         <w:t>9.1.2. Interfaces de Hardware</w:t>
       </w:r>
@@ -25109,7 +25251,7 @@
         <w:pStyle w:val="Heading3"/>
       </w:pPr>
       <w:bookmarkStart w:id="91" w:name="_Toc58077517"/>
-      <w:bookmarkStart w:id="92" w:name="_Toc229513526"/>
+      <w:bookmarkStart w:id="92" w:name="_Toc242216743"/>
       <w:r>
         <w:t>9.1.3. Interfaces de Software</w:t>
       </w:r>
@@ -25145,7 +25287,7 @@
         <w:pStyle w:val="Heading3"/>
       </w:pPr>
       <w:bookmarkStart w:id="93" w:name="_Toc58077518"/>
-      <w:bookmarkStart w:id="94" w:name="_Toc229513527"/>
+      <w:bookmarkStart w:id="94" w:name="_Toc242216744"/>
       <w:r>
         <w:t>9.1.4. Interfaces de Comunicación</w:t>
       </w:r>
@@ -25212,10 +25354,7 @@
         </w:numPr>
       </w:pPr>
       <w:r>
-        <w:t xml:space="preserve">Controlar el versionamiento del archivo WSDL: cualquier cambio en los parámetros del servidor exige actualizar el código de los cuatro clientes para evitar fallos de </w:t>
-      </w:r>
-      <w:r>
-        <w:t>comunicación.</w:t>
+        <w:t>Controlar el versionamiento del archivo WSDL: cualquier cambio en los parámetros del servidor exige actualizar el código de los cuatro clientes para evitar fallos de comunicación.</w:t>
       </w:r>
       <w:r>
         <w:t xml:space="preserve"> </w:t>
@@ -30952,6 +31091,7 @@
   <w:style w:type="character" w:default="1" w:styleId="DefaultParagraphFont">
     <w:name w:val="Default Paragraph Font"/>
     <w:uiPriority w:val="1"/>
+    <w:semiHidden/>
     <w:unhideWhenUsed/>
   </w:style>
   <w:style w:type="table" w:default="1" w:styleId="TableNormal">

</xml_diff>